<commit_message>
Week-12 report (Step 1-4, v4), INT8 quantization script, RUNLOG for Pi/C2/INT8 results
Co-Authored-By: Claude Sonnet 5.5 <noreply@anthropic.com>
Claude-Session: https://claude.ai/code/session_01YF3p9kAMy6zUoGND8BA4kD
</commit_message>
<xml_diff>
--- a/docs/Project_Report_EdgeAI_Group9_PPE.docx
+++ b/docs/Project_Report_EdgeAI_Group9_PPE.docx
@@ -4860,6 +4860,45 @@
       </w:pPr>
       <w:r>
         <w:t>Accuracy versus resolution (laptop, same 111-image test split, ppe_v1): AP50 at 640 / 416 — all classes 0.564 / 0.537, helmet 0.913 / 0.913, vest 0.867 / 0.872, gloves 0.722 / 0.664, goggles 0.772 / 0.641. Per person with the absence rule (precision / recall of 'missing'): helmet 0.91 / 1.00 vs 0.85 / 0.98, goggles 0.79 / 0.97 vs 0.79 / 0.97, vest 0.72 / 1.00 vs 0.71 / 0.96, gloves 0.74 / 0.97 vs 0.62 / 1.00. So 416 costs little for helmet and vest but gives more false 'missing' calls for gloves (22 vs 12) and lower goggles AP; whether to deploy 416 or 640 is not decided. This overall mAP50 at 640 (0.564) differs by 0.005 from the 0.559 quoted in Step 3.6; the cause was not investigated.</w:t>
+      </w:r>
+    </w:p>
+    <w:p>
+      <w:pPr>
+        <w:pStyle w:val="Heading2"/>
+        <w:spacing w:after="140" w:before="280"/>
+      </w:pPr>
+      <w:r>
+        <w:t>4.6 Pruning and Knowledge Distillation: Why They Were Not Applied</w:t>
+      </w:r>
+    </w:p>
+    <w:p>
+      <w:pPr>
+        <w:spacing w:after="160" w:line="276"/>
+      </w:pPr>
+      <w:r>
+        <w:rPr>
+          <w:b/>
+          <w:bCs/>
+        </w:rPr>
+        <w:t xml:space="preserve">Pruning. </w:t>
+      </w:r>
+      <w:r>
+        <w:t>Not applied; this is a judgement, not a measurement — no pruned model was trained or tested. (1) The baseline is already the smallest YOLOv8 variant: 3.14 million parameters, 8.8 GFLOPs, 12.7 MB in ONNX. (2) The Pi bottleneck was input resolution, not parameter count: going from 640 to 416 cut the model time from about 491 ms to 209 ms on the Pi (2.3 times), and the whole pipeline runs at about 3.5 FPS at 416 on a looped still photo — close to the 300 ms/frame target without removing any weights. (3) Unstructured pruning (zeroing weights) gives no speed-up on ONNX Runtime’s CPU path unless sparse kernels exist, which the lecture itself notes; structured pruning (removing filters) needs a prune–fine-tune–evaluate cycle on Colab. (4) The weakest classes (gloves 0.66–0.72, goggles 0.64–0.77 AP50) come from small objects and a small training set (3,632 images); pruning removes capacity first from exactly these fine features, and with a 111-image test split a loss of a few points could not be told apart from noise. It would be reconsidered if the full pipeline on the Pi stayed above 300 ms at the resolution needed for gloves and goggles.</w:t>
+      </w:r>
+    </w:p>
+    <w:p>
+      <w:pPr>
+        <w:spacing w:after="160" w:line="276"/>
+      </w:pPr>
+      <w:r>
+        <w:rPr>
+          <w:b/>
+          <w:bCs/>
+        </w:rPr>
+        <w:t xml:space="preserve">Knowledge distillation. </w:t>
+      </w:r>
+      <w:r>
+        <w:t>Not applied, for the same reason: it is a decision, not a test. (1) The student would be YOLOv8n, which is already the smallest model of its family, so there is no smaller student to distil into without changing the architecture. (2) A teacher (for example YOLOv8s or YOLOv8m) would first have to be trained on the same data, and Ultralytics has no built-in distillation loss, so a custom training loop would be needed — more code and Colab time than the remaining schedule allows. (3) The teacher would learn from the same small and partly noisy labels (no_* classes AP50 0.12–0.46; SH17 added no gain, see Step 3.6), so it has limited extra knowledge to pass on for gloves and goggles; the data, not the model size, looks like the limit. (4) Dynamic INT8 quantization, measured on this model, kept accuracy (mAP50 0.560 vs 0.563 at 640) but was slower on the laptop CPU, which is further evidence that compute is not what a smaller model would fix here. Distillation would be the next step if more labeled data from the rig becomes available and a larger teacher can be trained on it.</w:t>
       </w:r>
     </w:p>
     <w:p>

</xml_diff>